<commit_message>
Add Mercola role and refresh portfolio design
- Add Mercola Consulting Services entry to experience timeline and projects
- Insert matching Mercola entry at top of CV
- Refresh hero with gradient name, status pill, aurora background
- Add scroll-reveal animations and scroll-spy nav highlighting
- Add visual timeline rail, gradient section underlines, card hover lifts
</commit_message>
<xml_diff>
--- a/KV-CV-2026.docx
+++ b/KV-CV-2026.docx
@@ -705,6 +705,109 @@
           <w:spacing w:val="-2"/>
         </w:rPr>
         <w:t xml:space="preserve"> EXPERIENCE</w:t>
+      </w:r>
+    </w:p>
+    <w:p>
+      <w:pPr>
+        <w:pStyle w:val="Heading2"/>
+        <w:spacing w:before="252"/>
+        <w:ind w:left="359"/>
+      </w:pPr>
+      <w:r>
+        <w:rPr>
+          <w:color w:val="4E80BD"/>
+        </w:rPr>
+        <w:t>Mercola Consulting Services, LLC</w:t>
+      </w:r>
+      <w:r>
+        <w:rPr>
+          <w:color w:val="4E80BD"/>
+          <w:spacing w:val="-5"/>
+        </w:rPr>
+        <w:t xml:space="preserve"> </w:t>
+      </w:r>
+      <w:r>
+        <w:rPr>
+          <w:color w:val="4E80BD"/>
+        </w:rPr>
+        <w:t>–</w:t>
+      </w:r>
+      <w:r>
+        <w:rPr>
+          <w:color w:val="4E80BD"/>
+          <w:spacing w:val="-5"/>
+        </w:rPr>
+        <w:t xml:space="preserve"> </w:t>
+      </w:r>
+      <w:r>
+        <w:rPr>
+          <w:color w:val="4E80BD"/>
+        </w:rPr>
+        <w:t>Senior Mobile Application Developer</w:t>
+      </w:r>
+    </w:p>
+    <w:p>
+      <w:pPr>
+        <w:pStyle w:val="BodyText"/>
+        <w:spacing w:before="47"/>
+        <w:ind w:left="359"/>
+      </w:pPr>
+      <w:r>
+        <w:t xml:space="preserve">Mar 2026 – Present | Makati City</w:t>
+      </w:r>
+    </w:p>
+    <w:p>
+      <w:pPr>
+        <w:pStyle w:val="BodyText"/>
+      </w:pPr>
+    </w:p>
+    <w:p>
+      <w:pPr>
+        <w:pStyle w:val="ListParagraph"/>
+        <w:numPr>
+          <w:ilvl w:val="0"/>
+          <w:numId w:val="1"/>
+        </w:numPr>
+        <w:tabs>
+          <w:tab w:val="left" w:pos="504"/>
+        </w:tabs>
+        <w:ind w:left="504" w:hanging="144"/>
+      </w:pPr>
+      <w:r>
+        <w:t>Engaged in Android and iOS development for the Mercola healthcare app using the MVVM approach.</w:t>
+      </w:r>
+    </w:p>
+    <w:p>
+      <w:pPr>
+        <w:pStyle w:val="ListParagraph"/>
+        <w:numPr>
+          <w:ilvl w:val="0"/>
+          <w:numId w:val="1"/>
+        </w:numPr>
+        <w:tabs>
+          <w:tab w:val="left" w:pos="504"/>
+        </w:tabs>
+        <w:spacing w:before="38" w:line="276" w:lineRule="auto"/>
+        <w:ind w:right="296" w:firstLine="0"/>
+      </w:pPr>
+      <w:r>
+        <w:t xml:space="preserve">Leveraging AI tools — Claude, Gemini, and ChatGPT — to accelerate delivery, code review, and problem solving.</w:t>
+      </w:r>
+    </w:p>
+    <w:p>
+      <w:pPr>
+        <w:pStyle w:val="ListParagraph"/>
+        <w:numPr>
+          <w:ilvl w:val="0"/>
+          <w:numId w:val="1"/>
+        </w:numPr>
+        <w:tabs>
+          <w:tab w:val="left" w:pos="504"/>
+        </w:tabs>
+        <w:ind w:left="504" w:hanging="144"/>
+      </w:pPr>
+      <w:r>
+        <w:t>Collaborating across mobile platforms to ship reliable, user-focused healthcare experiences.</w:t>
       </w:r>
     </w:p>
     <w:p>

</xml_diff>